<commit_message>
feat: complete practices 04-06 and update KR2 report
</commit_message>
<xml_diff>
--- a/reports/КР1_ЭФБо-13-25_ПановАА.docx
+++ b/reports/КР1_ЭФБо-13-25_ПановАА.docx
@@ -161,7 +161,7 @@
           <w:b/>
           <w:sz w:val="22"/>
         </w:rPr>
-        <w:t>Группа: ЭФБо-13-25</w:t>
+        <w:t>Группа: ЭФБО-13-25</w:t>
       </w:r>
     </w:p>
     <w:p>
@@ -183,7 +183,7 @@
           <w:b/>
           <w:sz w:val="22"/>
         </w:rPr>
-        <w:t>Дата: 03.10.2026</w:t>
+        <w:t>Дата: 26.10.2026</w:t>
       </w:r>
     </w:p>
     <w:p>

</xml_diff>